<commit_message>
docx-pack: callout label dedupe, keep short tables together, metadata set by the builders
</commit_message>
<xml_diff>
--- a/examples/acme-memo.docx
+++ b/examples/acme-memo.docx
@@ -292,6 +292,7 @@
           </w:tcPr>
           <w:p>
             <w:pPr>
+              <w:keepNext/>
               <w:spacing w:after="60" w:before="0" w:line="240"/>
             </w:pPr>
             <w:r>
@@ -307,6 +308,7 @@
           </w:p>
           <w:p>
             <w:pPr>
+              <w:keepNext/>
               <w:spacing w:after="40" w:before="0" w:line="240"/>
             </w:pPr>
             <w:r>
@@ -323,6 +325,7 @@
           </w:p>
           <w:p>
             <w:pPr>
+              <w:keepNext/>
               <w:spacing w:after="0" w:before="0" w:line="220"/>
             </w:pPr>
             <w:r>
@@ -355,6 +358,7 @@
           </w:tcPr>
           <w:p>
             <w:pPr>
+              <w:keepNext/>
               <w:spacing w:after="60" w:before="0" w:line="240"/>
             </w:pPr>
             <w:r>
@@ -370,6 +374,7 @@
           </w:p>
           <w:p>
             <w:pPr>
+              <w:keepNext/>
               <w:spacing w:after="40" w:before="0" w:line="240"/>
             </w:pPr>
             <w:r>
@@ -386,6 +391,7 @@
           </w:p>
           <w:p>
             <w:pPr>
+              <w:keepNext/>
               <w:spacing w:after="0" w:before="0" w:line="220"/>
             </w:pPr>
             <w:r>
@@ -418,6 +424,7 @@
           </w:tcPr>
           <w:p>
             <w:pPr>
+              <w:keepNext/>
               <w:spacing w:after="60" w:before="0" w:line="240"/>
             </w:pPr>
             <w:r>
@@ -433,6 +440,7 @@
           </w:p>
           <w:p>
             <w:pPr>
+              <w:keepNext/>
               <w:spacing w:after="40" w:before="0" w:line="240"/>
             </w:pPr>
             <w:r>
@@ -449,6 +457,7 @@
           </w:p>
           <w:p>
             <w:pPr>
+              <w:keepNext/>
               <w:spacing w:after="0" w:before="0" w:line="220"/>
             </w:pPr>
             <w:r>
@@ -481,6 +490,7 @@
           </w:tcPr>
           <w:p>
             <w:pPr>
+              <w:keepNext/>
               <w:spacing w:after="60" w:before="0" w:line="240"/>
             </w:pPr>
             <w:r>
@@ -496,6 +506,7 @@
           </w:p>
           <w:p>
             <w:pPr>
+              <w:keepNext/>
               <w:spacing w:after="40" w:before="0" w:line="240"/>
             </w:pPr>
             <w:r>
@@ -512,6 +523,7 @@
           </w:p>
           <w:p>
             <w:pPr>
+              <w:keepNext/>
               <w:spacing w:after="0" w:before="0" w:line="220"/>
             </w:pPr>
             <w:r>
@@ -544,6 +556,7 @@
           </w:tcPr>
           <w:p>
             <w:pPr>
+              <w:keepNext/>
               <w:spacing w:after="60" w:before="0" w:line="240"/>
             </w:pPr>
             <w:r>
@@ -559,6 +572,7 @@
           </w:p>
           <w:p>
             <w:pPr>
+              <w:keepNext/>
               <w:spacing w:after="40" w:before="0" w:line="240"/>
             </w:pPr>
             <w:r>
@@ -575,6 +589,7 @@
           </w:p>
           <w:p>
             <w:pPr>
+              <w:keepNext/>
               <w:spacing w:after="0" w:before="0" w:line="220"/>
             </w:pPr>
             <w:r>
@@ -714,6 +729,7 @@
           </w:tcPr>
           <w:p>
             <w:pPr>
+              <w:keepNext/>
               <w:spacing w:after="0" w:before="0" w:line="240"/>
             </w:pPr>
             <w:r>
@@ -747,6 +763,7 @@
           </w:tcPr>
           <w:p>
             <w:pPr>
+              <w:keepNext/>
               <w:spacing w:after="0" w:before="0" w:line="240"/>
             </w:pPr>
             <w:r>
@@ -784,6 +801,7 @@
           </w:tcPr>
           <w:p>
             <w:pPr>
+              <w:keepNext/>
               <w:spacing w:after="0" w:before="0" w:line="240"/>
             </w:pPr>
             <w:r>
@@ -818,6 +836,7 @@
           </w:tcPr>
           <w:p>
             <w:pPr>
+              <w:keepNext/>
               <w:spacing w:after="0" w:before="0" w:line="240"/>
             </w:pPr>
             <w:r>
@@ -854,6 +873,7 @@
           </w:tcPr>
           <w:p>
             <w:pPr>
+              <w:keepNext/>
               <w:spacing w:after="0" w:before="0" w:line="240"/>
             </w:pPr>
             <w:r>
@@ -887,6 +907,7 @@
           </w:tcPr>
           <w:p>
             <w:pPr>
+              <w:keepNext/>
               <w:spacing w:after="0" w:before="0" w:line="240"/>
             </w:pPr>
             <w:r>
@@ -924,6 +945,7 @@
           </w:tcPr>
           <w:p>
             <w:pPr>
+              <w:keepNext/>
               <w:spacing w:after="0" w:before="0" w:line="240"/>
             </w:pPr>
             <w:r>
@@ -958,6 +980,7 @@
           </w:tcPr>
           <w:p>
             <w:pPr>
+              <w:keepNext/>
               <w:spacing w:after="0" w:before="0" w:line="240"/>
             </w:pPr>
             <w:r>
@@ -994,6 +1017,7 @@
           </w:tcPr>
           <w:p>
             <w:pPr>
+              <w:keepNext/>
               <w:spacing w:after="0" w:before="0" w:line="240"/>
             </w:pPr>
             <w:r>
@@ -1027,6 +1051,7 @@
           </w:tcPr>
           <w:p>
             <w:pPr>
+              <w:keepNext/>
               <w:spacing w:after="0" w:before="0" w:line="240"/>
             </w:pPr>
             <w:r>
@@ -1064,6 +1089,7 @@
           </w:tcPr>
           <w:p>
             <w:pPr>
+              <w:keepNext/>
               <w:spacing w:after="0" w:before="0" w:line="240"/>
             </w:pPr>
             <w:r>
@@ -1098,6 +1124,7 @@
           </w:tcPr>
           <w:p>
             <w:pPr>
+              <w:keepNext/>
               <w:spacing w:after="0" w:before="0" w:line="240"/>
             </w:pPr>
             <w:r>
@@ -1134,6 +1161,7 @@
           </w:tcPr>
           <w:p>
             <w:pPr>
+              <w:keepNext/>
               <w:spacing w:after="0" w:before="0" w:line="240"/>
             </w:pPr>
             <w:r>
@@ -1167,6 +1195,7 @@
           </w:tcPr>
           <w:p>
             <w:pPr>
+              <w:keepNext/>
               <w:spacing w:after="0" w:before="0" w:line="240"/>
             </w:pPr>
             <w:r>
@@ -1204,6 +1233,7 @@
           </w:tcPr>
           <w:p>
             <w:pPr>
+              <w:keepNext w:val="false"/>
               <w:spacing w:after="0" w:before="0" w:line="240"/>
             </w:pPr>
             <w:r>
@@ -1238,6 +1268,7 @@
           </w:tcPr>
           <w:p>
             <w:pPr>
+              <w:keepNext w:val="false"/>
               <w:spacing w:after="0" w:before="0" w:line="240"/>
             </w:pPr>
             <w:r>

</xml_diff>